<commit_message>
docs(paper): round-3 final ISDIA submission package - 12-page Final DOCX/PDF, 800dpi figures, ref re-audit, listing page-break fix, change log + checklist + author actions
</commit_message>
<xml_diff>
--- a/SANAD_Research_Paper.docx
+++ b/SANAD_Research_Paper.docx
@@ -81,14 +81,6 @@
     </w:p>
     <w:p>
       <w:pPr>
-        <w:pStyle w:val="email"/>
-      </w:pPr>
-      <w:r>
-        <w:t>e-mail: {to be supplied by the authors}</w:t>
-      </w:r>
-    </w:p>
-    <w:p>
-      <w:pPr>
         <w:pStyle w:val="abstract"/>
       </w:pPr>
       <w:r>
@@ -98,7 +90,7 @@
         <w:t xml:space="preserve">Abstract.  </w:t>
       </w:r>
       <w:r>
-        <w:t>The United Arab Emirates ranks among the world's leading digital governments, yet its largely expatriate resident population still faces three practical barriers when using public services: navigating services in more than one language, understanding which documents and eligibility rules apply, and producing trustworthy, privacy-safe records of unresolved complaints such as unpaid wages. We present SANAD, a prototype assistant that combines (i) a schema-constrained large-language-model front end that maps a free-text situation to services drawn exclusively from a curated catalogue of official UAE portals, (ii) an honest-degradation policy in which every AI output is labelled by source and sample fallbacks can never be issued as credentials, and (iii) a zero-personally-identifiable-information (zero-PII) verifiable-credential mechanism that anchors each confirmed claim to a salted SHA-256 digest recorded by an issuer-controlled smart contract on the Polygon Amoy testnet. The chain attests only to the existence and immutability of a record, never to the truth of its content - a distinction the design enforces in its user interface and in this paper. We describe the architecture, threat model and an automated validation suite (12 of 12 tests pass, including row-level-security isolation against a live PostgreSQL instance and contract-level checks for issuer-only access, duplicate rejection and revocation), and we report explicitly what is proven, what remains unverified, and the roadmap toward a production pilot.</w:t>
+        <w:t>The UAE is among the world's leading digital governments, yet its largely expatriate residents face three barriers to using public services: navigating them across languages, understanding which documents and rules apply, and producing privacy-safe records of unresolved complaints such as unpaid wages. We present SANAD, a prototype assistant combining a schema-constrained large-language-model front end that maps free-text situations only to services in a curated catalogue of official UAE portals; an honest-degradation policy that labels every AI output by source and blocks sample fallbacks from credential issuance; and a zero-personally-identifiable-information (zero-PII) verifiable-credential mechanism that anchors each user-confirmed claim to a salted SHA-256 digest recorded by an issuer-controlled smart contract on the Polygon Amoy testnet. The chain attests only a record's existence and immutability, never its truth. Twelve automated tests pass, including live-PostgreSQL row-level-security isolation, and a 16-case grounded-matcher benchmark returns 16 of 16 acceptable top matches with zero out-of-catalogue identifiers.</w:t>
       </w:r>
     </w:p>
     <w:p>
@@ -112,7 +104,7 @@
         <w:t xml:space="preserve">Keywords:  </w:t>
       </w:r>
       <w:r>
-        <w:t>electronic government, verifiable credentials, blockchain, large language models, data minimisation, multilingual access, United Arab Emirates</w:t>
+        <w:t>electronic government, verifiable credentials, blockchain, large language models, United Arab Emirates</w:t>
       </w:r>
     </w:p>
     <w:p>
@@ -128,7 +120,7 @@
         <w:pStyle w:val="p1a"/>
       </w:pPr>
       <w:r>
-        <w:t>The United Arab Emirates consistently performs at the top of global digital-government assessments: the 2024 United Nations E-Government Survey places the UAE 11th worldwide on the E-Government Development Index with a score of 0.9533, and first in its e-Government Literacy sub-index [1] [2]. Availability of online services, however, is not the same as accessibility of outcomes. The UAE population is majority foreign-born (commonly cited at roughly 88%, an indicative figure), and residents routinely interact with services - labour complaints, visa and status questions, wage protection, unemployment insurance, tenancy disputes - whose entry points are spread across portals such as u.ae and the Ministry of Human Resources and Emiratisation (MOHRE) [10].</w:t>
+        <w:t>The United Arab Emirates consistently performs at the top of global digital-government assessments: in the 2024 United Nations E-Government Survey it is the highest-ranked country in Western Asia, with an E-Government Development Index score of 0.9533, and the UAE government reports 11th place worldwide and first place in the e-Government Literacy sub-index [1] [2]. Availability of online services, however, is not the same as accessibility of outcomes. The UAE's population is majority foreign-born on the government's own account [11], a figure commonly cited at roughly 88%, and residents routinely interact with services - labour complaints, visa and status questions, wage protection, unemployment insurance, tenancy disputes - whose entry points are spread across portals such as u.ae and the Ministry of Human Resources and Emiratisation (MOHRE) [10].</w:t>
       </w:r>
     </w:p>
     <w:p>
@@ -146,7 +138,7 @@
     <w:p>
       <w:pPr/>
       <w:r>
-        <w:t>Contributions. (1) A grounded navigation pipeline in which a large language model (LLM) may only select service identifiers from a curated catalogue of official portals, so that hallucinated services are structurally impossible in the matching path. (2) A zero-PII verifiable-credential mechanism: canonical serialisation, a 32-byte random salt and a domain-separated SHA-256 digest, anchored by an issuer-controlled Solidity registry, with verification that recomputes integrity off-chain and existence on-chain. (3) An honest-degradation policy for AI features - clearly labelled sample fallbacks at zero confidence that are blocked from credential issuance. (4) An automated validation suite, including row-level-security (RLS) tests against a live PostgreSQL instance, together with a published taxonomy of what is and is not yet proven (Sect. 6, Table 1).</w:t>
+        <w:t>Contributions. (1) A grounded navigation pipeline in which a large language model (LLM) may only select service identifiers from a curated catalogue of official portals, so that out-of-catalogue services cannot reach the user; an incorrect match to a valid catalogue entry nevertheless remains possible and is treated as an open risk (Sect. 6.1). (2) A zero-PII verifiable-credential mechanism: canonical serialisation, a 32-byte random salt and a domain-separated SHA-256 digest, anchored by an issuer-controlled Solidity registry, with verification that recomputes integrity off-chain and existence on-chain. (3) An honest-degradation policy for AI features - clearly labelled sample fallbacks at zero confidence that are blocked from credential issuance. (4) An automated validation suite, including row-level-security (RLS) tests against a live PostgreSQL instance, together with a published taxonomy of what is and is not yet proven (Sect. 6, Table 2).</w:t>
       </w:r>
     </w:p>
     <w:p>
@@ -176,7 +168,7 @@
         <w:pStyle w:val="p1a"/>
       </w:pPr>
       <w:r>
-        <w:t>Since Nakamoto's proposal of an append-only, trust-minimised ledger [9], credential anchoring has become a recurring application: Blockcerts defined an open standard for blockchain-verified academic credentials issued by institutions [4], and later work surveyed blockchain approaches to credential management in education and beyond [5]. The W3C Verifiable Credentials Data Model gave the field a common representation for claims, proofs and subjects [3]. These systems typically put structured credential content - often including identifiers of the holder - into a signed artifact whose validity is checked against a ledger. SANAD takes the more restrictive route: no credential content is published at all. Only a digest computed over a canonicalised snapshot with a secret salt is recorded, so the ledger cannot be used to learn, correlate or enumerate anything about the holder.</w:t>
+        <w:t>Since Nakamoto's proposal of an append-only, trust-minimised ledger [9], credential anchoring has become a recurring application: Blockcerts defined an open standard for blockchain-verified academic credentials issued by institutions [4], and later work examined blockchain approaches specifically for academic credentials beyond the issuing institution [5]. The W3C Verifiable Credentials Data Model gave the field a common representation for claims, proofs and subjects [3]. These systems typically put structured credential content - often including identifiers of the holder - into a signed artifact whose validity is checked against a ledger. SANAD takes the more restrictive route: no credential content is published at all. Only a digest computed over a canonicalised snapshot with a secret salt is recorded, so the design is intended to prevent direct disclosure of claim contents through the public artifact and to resist dictionary enumeration of claims; metadata-level caveats are given in Sect. 4.4.</w:t>
       </w:r>
     </w:p>
     <w:p>
@@ -208,8 +200,381 @@
         <w:pStyle w:val="p1a"/>
       </w:pPr>
       <w:r>
-        <w:t>Existing gov-tech assistants optimise for conversational breadth; existing blockchain-credential systems optimise for portability of institutional attestations. SANAD targets the intersection that matters for resident-level disputes: a multilingual intake that is grounded by construction, and a trust artifact that is publishable without consent risk because it contains no personally identifiable information (PII). The PDPL principles of data minimisation and purpose limitation [7] guide the design: PII is confined to RLS-protected tables, and the public artifact is a hash.</w:t>
-      </w:r>
+        <w:t>Existing gov-tech assistants optimise for conversational breadth; existing blockchain-credential systems optimise for portability of institutional attestations. SANAD targets the intersection that matters for resident-level disputes: a multilingual intake whose outputs are constrained to a curated catalogue, and a trust artifact whose public form contains no personally identifiable information (PII), which reduces - though does not eliminate - consent risk (Sect. 4.4). The PDPL principles of data minimisation and purpose limitation [7] guide the design: PII is confined to RLS-protected tables, and the public artifact is a hash. Table 1 compares the approaches across the four properties that matter for this use case.</w:t>
+      </w:r>
+    </w:p>
+    <w:p>
+      <w:pPr>
+        <w:pStyle w:val="tabletitle"/>
+      </w:pPr>
+      <w:r>
+        <w:t>Table 1.  How SANAD differs from closely related approaches across the four properties that matter for resident-level, privacy-sensitive service navigation.</w:t>
+      </w:r>
+    </w:p>
+    <w:tbl>
+      <w:tblPr>
+        <w:tblW w:type="auto" w:w="0"/>
+        <w:tblLook w:firstColumn="1" w:firstRow="1" w:lastColumn="0" w:lastRow="0" w:noHBand="0" w:noVBand="1" w:val="04A0"/>
+        <w:tblBorders>
+          <w:top w:val="single" w:sz="6" w:space="0" w:color="000000"/>
+          <w:bottom w:val="single" w:sz="6" w:space="0" w:color="000000"/>
+          <w:insideH w:val="single" w:sz="6" w:space="0" w:color="000000"/>
+          <w:left w:val="none" w:sz="0" w:space="0" w:color="auto"/>
+          <w:right w:val="none" w:sz="0" w:space="0" w:color="auto"/>
+          <w:insideV w:val="none" w:sz="0" w:space="0" w:color="auto"/>
+        </w:tblBorders>
+      </w:tblPr>
+      <w:tblGrid>
+        <w:gridCol w:w="1383"/>
+        <w:gridCol w:w="1383"/>
+        <w:gridCol w:w="1383"/>
+        <w:gridCol w:w="1383"/>
+        <w:gridCol w:w="1383"/>
+      </w:tblGrid>
+      <w:tr>
+        <w:tc>
+          <w:tcPr>
+            <w:tcW w:type="dxa" w:w="1701"/>
+          </w:tcPr>
+          <w:p>
+            <w:r>
+              <w:rPr>
+                <w:b/>
+                <w:sz w:val="15"/>
+              </w:rPr>
+              <w:t>Approach</w:t>
+            </w:r>
+          </w:p>
+        </w:tc>
+        <w:tc>
+          <w:tcPr>
+            <w:tcW w:type="dxa" w:w="1474"/>
+          </w:tcPr>
+          <w:p>
+            <w:r>
+              <w:rPr>
+                <w:b/>
+                <w:sz w:val="15"/>
+              </w:rPr>
+              <w:t>PII / content on-chain</w:t>
+            </w:r>
+          </w:p>
+        </w:tc>
+        <w:tc>
+          <w:tcPr>
+            <w:tcW w:type="dxa" w:w="1474"/>
+          </w:tcPr>
+          <w:p>
+            <w:r>
+              <w:rPr>
+                <w:b/>
+                <w:sz w:val="15"/>
+              </w:rPr>
+              <w:t>Grounded to official catalogue</w:t>
+            </w:r>
+          </w:p>
+        </w:tc>
+        <w:tc>
+          <w:tcPr>
+            <w:tcW w:type="dxa" w:w="1247"/>
+          </w:tcPr>
+          <w:p>
+            <w:r>
+              <w:rPr>
+                <w:b/>
+                <w:sz w:val="15"/>
+              </w:rPr>
+              <w:t>Honest-degradation policy</w:t>
+            </w:r>
+          </w:p>
+        </w:tc>
+        <w:tc>
+          <w:tcPr>
+            <w:tcW w:type="dxa" w:w="1020"/>
+          </w:tcPr>
+          <w:p>
+            <w:r>
+              <w:rPr>
+                <w:b/>
+                <w:sz w:val="15"/>
+              </w:rPr>
+              <w:t>User-confirmed anchor</w:t>
+            </w:r>
+          </w:p>
+        </w:tc>
+      </w:tr>
+      <w:tr>
+        <w:tc>
+          <w:tcPr>
+            <w:tcW w:type="dxa" w:w="1701"/>
+          </w:tcPr>
+          <w:p>
+            <w:r>
+              <w:rPr>
+                <w:sz w:val="15"/>
+              </w:rPr>
+              <w:t>Blockcerts / institutional VC [3,4]</w:t>
+            </w:r>
+          </w:p>
+        </w:tc>
+        <w:tc>
+          <w:tcPr>
+            <w:tcW w:type="dxa" w:w="1474"/>
+          </w:tcPr>
+          <w:p>
+            <w:r>
+              <w:rPr>
+                <w:sz w:val="15"/>
+              </w:rPr>
+              <w:t>Signed credential content</w:t>
+            </w:r>
+          </w:p>
+        </w:tc>
+        <w:tc>
+          <w:tcPr>
+            <w:tcW w:type="dxa" w:w="1474"/>
+          </w:tcPr>
+          <w:p>
+            <w:r>
+              <w:rPr>
+                <w:sz w:val="15"/>
+              </w:rPr>
+              <w:t>No</w:t>
+            </w:r>
+          </w:p>
+        </w:tc>
+        <w:tc>
+          <w:tcPr>
+            <w:tcW w:type="dxa" w:w="1247"/>
+          </w:tcPr>
+          <w:p>
+            <w:r>
+              <w:rPr>
+                <w:sz w:val="15"/>
+              </w:rPr>
+              <w:t>No</w:t>
+            </w:r>
+          </w:p>
+        </w:tc>
+        <w:tc>
+          <w:tcPr>
+            <w:tcW w:type="dxa" w:w="1020"/>
+          </w:tcPr>
+          <w:p>
+            <w:r>
+              <w:rPr>
+                <w:sz w:val="15"/>
+              </w:rPr>
+              <w:t>Issuer attestation</w:t>
+            </w:r>
+          </w:p>
+        </w:tc>
+      </w:tr>
+      <w:tr>
+        <w:tc>
+          <w:tcPr>
+            <w:tcW w:type="dxa" w:w="1701"/>
+          </w:tcPr>
+          <w:p>
+            <w:r>
+              <w:rPr>
+                <w:sz w:val="15"/>
+              </w:rPr>
+              <w:t>Blockchain academic credentials [5]</w:t>
+            </w:r>
+          </w:p>
+        </w:tc>
+        <w:tc>
+          <w:tcPr>
+            <w:tcW w:type="dxa" w:w="1474"/>
+          </w:tcPr>
+          <w:p>
+            <w:r>
+              <w:rPr>
+                <w:sz w:val="15"/>
+              </w:rPr>
+              <w:t>Credential identifiers</w:t>
+            </w:r>
+          </w:p>
+        </w:tc>
+        <w:tc>
+          <w:tcPr>
+            <w:tcW w:type="dxa" w:w="1474"/>
+          </w:tcPr>
+          <w:p>
+            <w:r>
+              <w:rPr>
+                <w:sz w:val="15"/>
+              </w:rPr>
+              <w:t>No</w:t>
+            </w:r>
+          </w:p>
+        </w:tc>
+        <w:tc>
+          <w:tcPr>
+            <w:tcW w:type="dxa" w:w="1247"/>
+          </w:tcPr>
+          <w:p>
+            <w:r>
+              <w:rPr>
+                <w:sz w:val="15"/>
+              </w:rPr>
+              <w:t>No</w:t>
+            </w:r>
+          </w:p>
+        </w:tc>
+        <w:tc>
+          <w:tcPr>
+            <w:tcW w:type="dxa" w:w="1020"/>
+          </w:tcPr>
+          <w:p>
+            <w:r>
+              <w:rPr>
+                <w:sz w:val="15"/>
+              </w:rPr>
+              <w:t>Issuer attestation</w:t>
+            </w:r>
+          </w:p>
+        </w:tc>
+      </w:tr>
+      <w:tr>
+        <w:tc>
+          <w:tcPr>
+            <w:tcW w:type="dxa" w:w="1701"/>
+          </w:tcPr>
+          <w:p>
+            <w:r>
+              <w:rPr>
+                <w:sz w:val="15"/>
+              </w:rPr>
+              <w:t>Generic LLM gov-assistant</w:t>
+            </w:r>
+          </w:p>
+        </w:tc>
+        <w:tc>
+          <w:tcPr>
+            <w:tcW w:type="dxa" w:w="1474"/>
+          </w:tcPr>
+          <w:p>
+            <w:r>
+              <w:rPr>
+                <w:sz w:val="15"/>
+              </w:rPr>
+              <w:t>None, but no anchor</w:t>
+            </w:r>
+          </w:p>
+        </w:tc>
+        <w:tc>
+          <w:tcPr>
+            <w:tcW w:type="dxa" w:w="1474"/>
+          </w:tcPr>
+          <w:p>
+            <w:r>
+              <w:rPr>
+                <w:sz w:val="15"/>
+              </w:rPr>
+              <w:t>No (hallucination risk)</w:t>
+            </w:r>
+          </w:p>
+        </w:tc>
+        <w:tc>
+          <w:tcPr>
+            <w:tcW w:type="dxa" w:w="1247"/>
+          </w:tcPr>
+          <w:p>
+            <w:r>
+              <w:rPr>
+                <w:sz w:val="15"/>
+              </w:rPr>
+              <w:t>No (silent fallbacks)</w:t>
+            </w:r>
+          </w:p>
+        </w:tc>
+        <w:tc>
+          <w:tcPr>
+            <w:tcW w:type="dxa" w:w="1020"/>
+          </w:tcPr>
+          <w:p>
+            <w:r>
+              <w:rPr>
+                <w:sz w:val="15"/>
+              </w:rPr>
+              <w:t>None</w:t>
+            </w:r>
+          </w:p>
+        </w:tc>
+      </w:tr>
+      <w:tr>
+        <w:tc>
+          <w:tcPr>
+            <w:tcW w:type="dxa" w:w="1701"/>
+          </w:tcPr>
+          <w:p>
+            <w:r>
+              <w:rPr>
+                <w:sz w:val="15"/>
+              </w:rPr>
+              <w:t>SANAD (ours)</w:t>
+            </w:r>
+          </w:p>
+        </w:tc>
+        <w:tc>
+          <w:tcPr>
+            <w:tcW w:type="dxa" w:w="1474"/>
+          </w:tcPr>
+          <w:p>
+            <w:r>
+              <w:rPr>
+                <w:sz w:val="15"/>
+              </w:rPr>
+              <w:t>None (salted digest only)</w:t>
+            </w:r>
+          </w:p>
+        </w:tc>
+        <w:tc>
+          <w:tcPr>
+            <w:tcW w:type="dxa" w:w="1474"/>
+          </w:tcPr>
+          <w:p>
+            <w:r>
+              <w:rPr>
+                <w:sz w:val="15"/>
+              </w:rPr>
+              <w:t>Yes (28-entry catalogue)</w:t>
+            </w:r>
+          </w:p>
+        </w:tc>
+        <w:tc>
+          <w:tcPr>
+            <w:tcW w:type="dxa" w:w="1247"/>
+          </w:tcPr>
+          <w:p>
+            <w:r>
+              <w:rPr>
+                <w:sz w:val="15"/>
+              </w:rPr>
+              <w:t>Yes (labelled, 503)</w:t>
+            </w:r>
+          </w:p>
+        </w:tc>
+        <w:tc>
+          <w:tcPr>
+            <w:tcW w:type="dxa" w:w="1020"/>
+          </w:tcPr>
+          <w:p>
+            <w:r>
+              <w:rPr>
+                <w:sz w:val="15"/>
+              </w:rPr>
+              <w:t>Yes (user-confirmed)</w:t>
+            </w:r>
+          </w:p>
+        </w:tc>
+      </w:tr>
+    </w:tbl>
+    <w:p>
+      <w:pPr/>
+      <w:r/>
     </w:p>
     <w:p>
       <w:pPr>
@@ -277,13 +642,60 @@
     <w:p>
       <w:pPr/>
       <w:r>
-        <w:t>A session begins either with Supabase authentication or with a signed demo cookie (HMAC-SHA-256 over an identifier and expiry, httpOnly, SameSite=Lax). Every mutating route handler resolves the caller through a single actor() helper before touching data; unauthenticated requests receive 401 and the interface responds with an explicit sign-in prompt rather than silently showing another user's data. The user describes a situation in their own language; the AI layer extracts structured facts and matches the situation against the official-services catalogue; document analysis (e.g. a wage slip or contract photo) can attach evidence summaries; the user then confirms or edits the resulting claim statement. Only a confirmed claim is snapshotted, hashed and - in real mode - issued on-chain. The catalogue itself is data, not model memory: 28 curated entries, each linking to u.ae or mohre.gov.ae, with supported-situation tags used for deterministic pre-filtering before the model is consulted.</w:t>
+        <w:t>A session begins either with Supabase authentication or with a signed demo cookie (HMAC-SHA-256 over an identifier and expiry, httpOnly, SameSite=Lax). Every mutating route handler resolves the caller through a single actor() helper before touching data; unauthenticated requests receive 401 and the interface prompts for sign-in rather than silently showing another user's data. The user describes a situation in their own language; the AI layer extracts structured facts and matches the situation against the official-services catalogue; document analysis (e.g. a wage slip or contract photo) can attach evidence summaries; the user then confirms or edits the resulting claim statement. Only a confirmed claim is snapshotted, hashed and - in real mode - issued on-chain. The catalogue itself is data, not model memory: 28 curated entries, each linking to u.ae or mohre.gov.ae, with supported-situation tags used for deterministic pre-filtering before the model is consulted.</w:t>
       </w:r>
     </w:p>
     <w:p>
       <w:pPr/>
       <w:r>
-        <w:t>The interface ships with five hand-curated locales - English, Arabic (RTL), Hindi, Urdu (RTL) and Bengali - plus machine-translated coverage of additional resident languages via an in-page translator, so the intake path is usable without English proficiency.</w:t>
+        <w:t>The interface ships with five hand-curated locales - English, Arabic (RTL), Hindi, Urdu (RTL) and Bengali - plus machine-translated coverage of additional resident languages via an in-page translator, so the intake path is usable without English proficiency. Figure 2 shows four production screens captured from the running prototype.</w:t>
+      </w:r>
+    </w:p>
+    <w:p>
+      <w:pPr>
+        <w:jc w:val="center"/>
+      </w:pPr>
+      <w:r>
+        <w:drawing>
+          <wp:inline xmlns:a="http://schemas.openxmlformats.org/drawingml/2006/main" xmlns:pic="http://schemas.openxmlformats.org/drawingml/2006/picture">
+            <wp:extent cx="4392000" cy="3123879"/>
+            <wp:docPr id="2" name="Picture 2"/>
+            <wp:cNvGraphicFramePr>
+              <a:graphicFrameLocks noChangeAspect="1"/>
+            </wp:cNvGraphicFramePr>
+            <a:graphic>
+              <a:graphicData uri="http://schemas.openxmlformats.org/drawingml/2006/picture">
+                <pic:pic>
+                  <pic:nvPicPr>
+                    <pic:cNvPr id="0" name="fig2_interfaces.png"/>
+                    <pic:cNvPicPr/>
+                  </pic:nvPicPr>
+                  <pic:blipFill>
+                    <a:blip r:embed="rId15"/>
+                    <a:stretch>
+                      <a:fillRect/>
+                    </a:stretch>
+                  </pic:blipFill>
+                  <pic:spPr>
+                    <a:xfrm>
+                      <a:off x="0" y="0"/>
+                      <a:ext cx="4392000" cy="3123879"/>
+                    </a:xfrm>
+                    <a:prstGeom prst="rect"/>
+                  </pic:spPr>
+                </pic:pic>
+              </a:graphicData>
+            </a:graphic>
+          </wp:inline>
+        </w:drawing>
+      </w:r>
+    </w:p>
+    <w:p>
+      <w:pPr>
+        <w:pStyle w:val="figurelegend"/>
+      </w:pPr>
+      <w:r>
+        <w:t>Fig. 2.  Prototype screens (captured live, not mock-ups). (a) Situation intake with voice input and multilingual example prompts; (b) dashboard with the explicit sign-in banner that replaced anonymous claim access and the five-stage journey tracker; (c) grounded service list with relevance, Verified and Docs-required tags linking to official portals; (d) the public verifier that resolves a credential ID to an on-chain existence proof.</w:t>
       </w:r>
     </w:p>
     <w:p>
@@ -341,7 +753,7 @@
         <w:pStyle w:val="p1a"/>
       </w:pPr>
       <w:r>
-        <w:t>The on-chain component is deliberately minimal: a single contract whose issuer key is immutable, with issue, revoke and a free status view (Listing 1). Duplicate issuance for an identifier is rejected; revocation is one-way; the stored record hash is never overwritten, giving tamper-evidence against any later change of the off-chain snapshot.</w:t>
+        <w:t>The on-chain component is deliberately minimal: a single contract whose issuer key is immutable, with issue, revoke and a free status view. Listing 1 is an abridged excerpt: the constructor, the Revoked event and the revoke body (guarding NotIssued and AlreadyRevoked) are omitted for space but implement exactly the semantics described here. Duplicate issuance for an identifier is rejected; revocation is one-way; the stored record hash is never overwritten, giving tamper-evidence against any later change of the off-chain snapshot. The issuer account is the project team's deployment wallet, not a government authority: an anchor therefore records the existence of a user-confirmed claim and must not be read as official government verification.</w:t>
       </w:r>
     </w:p>
     <w:p>
@@ -349,6 +761,9 @@
         <w:pStyle w:val="programcode"/>
       </w:pPr>
       <w:r>
+        <w:rPr>
+          <w:sz w:val="16"/>
+        </w:rPr>
         <w:t>contract SANADCredential {</w:t>
       </w:r>
     </w:p>
@@ -357,6 +772,9 @@
         <w:pStyle w:val="programcode"/>
       </w:pPr>
       <w:r>
+        <w:rPr>
+          <w:sz w:val="16"/>
+        </w:rPr>
         <w:t xml:space="preserve">    address public immutable issuer;</w:t>
       </w:r>
     </w:p>
@@ -365,6 +783,9 @@
         <w:pStyle w:val="programcode"/>
       </w:pPr>
       <w:r>
+        <w:rPr>
+          <w:sz w:val="16"/>
+        </w:rPr>
         <w:t xml:space="preserve">    struct Credential { bytes32 recordHash; address issuedBy;</w:t>
       </w:r>
     </w:p>
@@ -373,6 +794,9 @@
         <w:pStyle w:val="programcode"/>
       </w:pPr>
       <w:r>
+        <w:rPr>
+          <w:sz w:val="16"/>
+        </w:rPr>
         <w:t xml:space="preserve">                        uint64 issuedAt; bool revoked; }</w:t>
       </w:r>
     </w:p>
@@ -381,6 +805,9 @@
         <w:pStyle w:val="programcode"/>
       </w:pPr>
       <w:r>
+        <w:rPr>
+          <w:sz w:val="16"/>
+        </w:rPr>
         <w:t xml:space="preserve">    mapping(bytes32 =&gt; Credential) private records;</w:t>
       </w:r>
     </w:p>
@@ -389,6 +816,9 @@
         <w:pStyle w:val="programcode"/>
       </w:pPr>
       <w:r>
+        <w:rPr>
+          <w:sz w:val="16"/>
+        </w:rPr>
         <w:t xml:space="preserve">    event Issued(bytes32 indexed id, bytes32 indexed recordHash,</w:t>
       </w:r>
     </w:p>
@@ -397,6 +827,9 @@
         <w:pStyle w:val="programcode"/>
       </w:pPr>
       <w:r>
+        <w:rPr>
+          <w:sz w:val="16"/>
+        </w:rPr>
         <w:t xml:space="preserve">                 address indexed issuer);</w:t>
       </w:r>
     </w:p>
@@ -405,6 +838,9 @@
         <w:pStyle w:val="programcode"/>
       </w:pPr>
       <w:r>
+        <w:rPr>
+          <w:sz w:val="16"/>
+        </w:rPr>
         <w:t xml:space="preserve">    modifier onlyIssuer() {</w:t>
       </w:r>
     </w:p>
@@ -413,6 +849,9 @@
         <w:pStyle w:val="programcode"/>
       </w:pPr>
       <w:r>
+        <w:rPr>
+          <w:sz w:val="16"/>
+        </w:rPr>
         <w:t xml:space="preserve">        if (msg.sender != issuer) revert NotIssuer(); _; }</w:t>
       </w:r>
     </w:p>
@@ -421,7 +860,10 @@
         <w:pStyle w:val="programcode"/>
       </w:pPr>
       <w:r>
-        <w:t xml:space="preserve">    function issue(bytes32 id, bytes32 recordHash) external onlyIssuer {</w:t>
+        <w:rPr>
+          <w:sz w:val="16"/>
+        </w:rPr>
+        <w:t xml:space="preserve">    function issue(bytes32 id, bytes32 recordHash)</w:t>
       </w:r>
     </w:p>
     <w:p>
@@ -429,6 +871,20 @@
         <w:pStyle w:val="programcode"/>
       </w:pPr>
       <w:r>
+        <w:rPr>
+          <w:sz w:val="16"/>
+        </w:rPr>
+        <w:t xml:space="preserve">            external onlyIssuer {</w:t>
+      </w:r>
+    </w:p>
+    <w:p>
+      <w:pPr>
+        <w:pStyle w:val="programcode"/>
+      </w:pPr>
+      <w:r>
+        <w:rPr>
+          <w:sz w:val="16"/>
+        </w:rPr>
         <w:t xml:space="preserve">        if (records[id].issuedAt != 0) revert AlreadyIssued();</w:t>
       </w:r>
     </w:p>
@@ -437,6 +893,9 @@
         <w:pStyle w:val="programcode"/>
       </w:pPr>
       <w:r>
+        <w:rPr>
+          <w:sz w:val="16"/>
+        </w:rPr>
         <w:t xml:space="preserve">        records[id] = Credential(recordHash, msg.sender,</w:t>
       </w:r>
     </w:p>
@@ -445,6 +904,9 @@
         <w:pStyle w:val="programcode"/>
       </w:pPr>
       <w:r>
+        <w:rPr>
+          <w:sz w:val="16"/>
+        </w:rPr>
         <w:t xml:space="preserve">                                 uint64(block.timestamp), false);</w:t>
       </w:r>
     </w:p>
@@ -453,6 +915,9 @@
         <w:pStyle w:val="programcode"/>
       </w:pPr>
       <w:r>
+        <w:rPr>
+          <w:sz w:val="16"/>
+        </w:rPr>
         <w:t xml:space="preserve">        emit Issued(id, recordHash, msg.sender);</w:t>
       </w:r>
     </w:p>
@@ -461,6 +926,9 @@
         <w:pStyle w:val="programcode"/>
       </w:pPr>
       <w:r>
+        <w:rPr>
+          <w:sz w:val="16"/>
+        </w:rPr>
         <w:t xml:space="preserve">    }</w:t>
       </w:r>
     </w:p>
@@ -469,6 +937,9 @@
         <w:pStyle w:val="programcode"/>
       </w:pPr>
       <w:r>
+        <w:rPr>
+          <w:sz w:val="16"/>
+        </w:rPr>
         <w:t xml:space="preserve">    function status(bytes32 id) external view</w:t>
       </w:r>
     </w:p>
@@ -477,6 +948,9 @@
         <w:pStyle w:val="programcode"/>
       </w:pPr>
       <w:r>
+        <w:rPr>
+          <w:sz w:val="16"/>
+        </w:rPr>
         <w:t xml:space="preserve">            returns (bytes32, address, uint64, bool) {</w:t>
       </w:r>
     </w:p>
@@ -485,6 +959,9 @@
         <w:pStyle w:val="programcode"/>
       </w:pPr>
       <w:r>
+        <w:rPr>
+          <w:sz w:val="16"/>
+        </w:rPr>
         <w:t xml:space="preserve">        Credential storage e = records[id];</w:t>
       </w:r>
     </w:p>
@@ -493,22 +970,33 @@
         <w:pStyle w:val="programcode"/>
       </w:pPr>
       <w:r>
+        <w:rPr>
+          <w:sz w:val="16"/>
+        </w:rPr>
         <w:t xml:space="preserve">        return (e.recordHash, e.issuedBy, e.issuedAt, e.revoked);</w:t>
       </w:r>
     </w:p>
     <w:p>
       <w:pPr>
         <w:pStyle w:val="programcode"/>
-      </w:pPr>
-      <w:r>
+        <w:keepNext/>
+      </w:pPr>
+      <w:r>
+        <w:rPr>
+          <w:sz w:val="16"/>
+        </w:rPr>
         <w:t xml:space="preserve">    }</w:t>
       </w:r>
     </w:p>
     <w:p>
       <w:pPr>
         <w:pStyle w:val="programcode"/>
-      </w:pPr>
-      <w:r>
+        <w:keepNext/>
+      </w:pPr>
+      <w:r>
+        <w:rPr>
+          <w:sz w:val="16"/>
+        </w:rPr>
         <w:t>}</w:t>
       </w:r>
     </w:p>
@@ -517,7 +1005,7 @@
         <w:pStyle w:val="figurelegend"/>
       </w:pPr>
       <w:r>
-        <w:t>Listing 1.  Core of the deployed SANADCredential registry (Solidity ^0.8.24, MIT).</w:t>
+        <w:t>Listing 1.  Abridged excerpt of the SANADCredential registry (Solidity ^0.8.24, MIT); complete source is in the repository.</w:t>
       </w:r>
     </w:p>
     <w:p>
@@ -538,6 +1026,34 @@
     </w:p>
     <w:p>
       <w:pPr>
+        <w:pStyle w:val="heading20"/>
+      </w:pPr>
+      <w:r>
+        <w:t>4.4   Threat Model, Issuer-Key Risk and Retention</w:t>
+      </w:r>
+    </w:p>
+    <w:p>
+      <w:pPr>
+        <w:pStyle w:val="p1a"/>
+      </w:pPr>
+      <w:r>
+        <w:t>We make three adversary classes explicit. A chain observer sees only an opaque identifier and a 32-byte digest; because the digest is salted with a per-credential 32-byte secret held off-chain, guessing the snapshot contents is insufficient to reproduce it, so the observer cannot recover claim content through a dictionary attack. A database adversary who defeats row-level security can read snapshots and salts, but still cannot forge a valid on-chain anchor without the issuer key, and any silent edit of a stored snapshot breaks the integrity recomputation in Sect. 4.3. A holder of the issuer key can issue or revoke records; this is the principal trust assumption. It is not mitigated away - the issuer address is immutable and every issue/revoke emits a public event, so abuse is attributable and visible rather than impossible, and production use should replace the single key with a multisig or HSM and a documented revocation policy.</w:t>
+      </w:r>
+    </w:p>
+    <w:p>
+      <w:pPr/>
+      <w:r>
+        <w:t>Retention and the zero-PII scope are stated narrowly. Snapshots and salts persist server-side under RLS. User-facing deletion is currently implemented for uploaded documents; claim-level deletion of snapshots and salts is a designed control that the prototype does not yet ship. Its semantics matter: deletion removes nothing from the chain - digests and events are immutable - it only withdraws the data with which the application could recompute the digest, so the anchor becomes unverifiable rather than deleted. That is the intended right-to-erasure property, ensuring an anchor cannot outlive the consent that created it once deletion ships. Finally, “zero-PII” is a statement about the public artifact, not a legal conclusion: the design is consistent with the PDPL principles of data minimisation and purpose limitation [7], but we do not claim that it, by itself, establishes regulatory compliance.</w:t>
+      </w:r>
+    </w:p>
+    <w:p>
+      <w:pPr/>
+      <w:r>
+        <w:t>What the salted digest does not hide is equally important. Public transaction metadata - the issuer address, event ordering and block timestamps - can correlate issuance activity over time even though it reveals no claim content, and application logs, session identifiers and the anchoring wallet address are themselves potentially personal data under the PDPL; “zero-PII” therefore describes the public credential artifact, not the system's entire data footprint. Separately, situation text and documents submitted for analysis are transmitted to the model provider (Google's Gemini API, reached through the AI SDK) for inference; while in flight or in the provider's systems they are outside our database and therefore outside RLS's protection entirely, governed by the provider's API terms rather than by our design. A salted hash establishes a commitment to one exact representation of a snapshot; it guarantees neither anonymity nor that the represented statement is true.</w:t>
+      </w:r>
+    </w:p>
+    <w:p>
+      <w:pPr>
         <w:pStyle w:val="heading10"/>
       </w:pPr>
       <w:r>
@@ -549,7 +1065,7 @@
         <w:pStyle w:val="p1a"/>
       </w:pPr>
       <w:r>
-        <w:t>Two AI endpoints carry user-visible risk: situation understanding (free text or voice transcript to structured facts and service matches) and document analysis (photo or PDF to extracted fields and risk flags). Both are schema-constrained: generateObject is given a Zod schema and a prompt that embeds the catalogue and forbids inventing services; returned identifiers are joined back to catalogue entries and any identifier not present in the catalogue is dropped before rendering. The user therefore only ever sees official, linkable services.</w:t>
+        <w:t>Two AI endpoints carry user-visible risk: situation understanding (free text or voice transcript to structured facts and service matches) and document analysis (photo or PDF to extracted fields and risk flags). Both are schema-constrained: generateObject is given a Zod schema and a prompt that embeds the catalogue and forbids inventing services; returned identifiers are joined back to catalogue entries and any identifier not present in the catalogue is dropped before rendering. The user therefore only ever sees official, linkable services. Grounding of this kind excludes invented services; it does not guarantee that the best catalogue entry was chosen, and measuring that residual risk is the purpose of Sect. 6.1.</w:t>
       </w:r>
     </w:p>
     <w:p>
@@ -571,13 +1087,84 @@
         <w:pStyle w:val="p1a"/>
       </w:pPr>
       <w:r>
-        <w:t>The repository implements 24 application routes (13 statically prerendered, 11 server-rendered), the credential contract, the catalogue as typed data, and an automated test suite. At submission time the following evidence holds, and Table 1 records what each result does and does not support.</w:t>
+        <w:t>The repository implements 24 application routes (13 statically prerendered, 11 server-rendered), the credential contract, the catalogue as typed data, and an automated test suite. At submission time the following evidence holds, and Table 2 records what each result does and does not support.</w:t>
       </w:r>
     </w:p>
     <w:p>
       <w:pPr/>
       <w:r>
-        <w:t>Static and build checks: TypeScript strict type-check passes; ESLint reports zero errors (ten warnings); next build completes for all 24 routes. Functional tests: the Vitest suite passes 12/12, including RLS isolation tests executed against a live PostgreSQL instance that assert one user cannot read or write another user's claims and credentials. Contract checks: local harnesses verify issuer-only issue and revoke, immutability of the stored hash, duplicate-issuance rejection and revocation semantics; a preflight against the Amoy testnet confirms the deployed ABI matches the client (issue(bytes32,bytes32), revoke(bytes32), status(bytes32)). Security review remediation: previously committed credentials were removed from the working tree and HEAD, unauthenticated claim reads were closed by enforcing actor() plus per-user filtering on every claims path, and fabricated AI fallbacks were replaced by the labelled-sample policy of Sect. 5. Secrets that had entered git history remain a rotation obligation, tracked as pending on the authors' side.</w:t>
+        <w:t>Static and build checks: TypeScript strict type-check passes; ESLint reports zero errors (ten warnings); next build completes for all 24 routes. Functional tests: the Vitest suite passes 12/12, including RLS isolation tests executed against a live PostgreSQL instance that assert one user cannot read or write another user's claims and credentials. Contract checks: local harnesses verify issuer-only issue and revoke, immutability of the stored hash, duplicate-issuance rejection and revocation semantics; a preflight against the Amoy testnet confirms the deployed ABI matches the client (issue(bytes32,bytes32), revoke(bytes32), status(bytes32)), and a read-only bytecode comparison shows the deployed runtime code is identical to the locally compiled source once solc metadata and the deploy-time issuer literal are normalised out; we did not run third-party source verification on a block explorer. Security review remediation: committed credentials were removed from the working tree and HEAD, unauthenticated claim reads were closed (actor() plus per-user filtering on every claims path), and fabricated AI fallbacks were replaced by the labelled-sample policy of Sect. 5. Secrets that had entered git history remain a rotation obligation, tracked as pending on the authors' side.</w:t>
+      </w:r>
+    </w:p>
+    <w:p>
+      <w:pPr>
+        <w:pStyle w:val="heading20"/>
+      </w:pPr>
+      <w:r>
+        <w:t>6.1   Grounded-Matcher Benchmark</w:t>
+      </w:r>
+    </w:p>
+    <w:p>
+      <w:pPr>
+        <w:pStyle w:val="p1a"/>
+      </w:pPr>
+      <w:r>
+        <w:t>To move beyond the qualitative grounding argument of Sect. 5, we exercised the live production endpoint (POST /api/services/match on the built server, same prompt, Zod schema and 28-entry catalogue as the shipped app) over 16 free-text situations. The cases span five input-language groups covering six written varieties: English (11 cases), Hinglish and Roman Urdu (2 cases, grouped as Latin-script mixed transcriptions), Arabic script (1), Devanagari Hindi (1) and Bengali (1). Cases were authored and annotated by one of the authors, each carrying an acceptable service-id set derived from the catalogue's own situation tags: ground truth is reproducible from repository data rather than hand-asserted, but the annotation is single-annotator and the sample is deliberately English-heavy, so per-language counts are reported descriptively and no equal coverage across languages is claimed. We report hit@1 (top match acceptable), hit@3 (any of the returned matches acceptable) and the count of out-of-catalogue identifiers. Result (Figure 3): 16/16 hit@1, 16/16 hit@3, 0 out-of-catalogue ids, 2.69 matches per case and a median end-to-end route latency of 1468 ms (range 1217-1910 ms); latency is measured at the server route and therefore includes the model-provider round trip and network overhead, but excludes client rendering. All 16 calls succeeded on the first attempt in the final run; two transient provider 500s observed during earlier development runs (both recovered on retry) are reported as provider-reliability noise rather than hidden. Every returned identifier resolved to a real official service, and every top match was checked against its case text. This is consistent with the grounding design of Sect. 5 - grounding rules out invented services, not wrong-but-valid catalogue matches, which would require a larger, independently annotated set including ambiguous, out-of-scope and adversarial inputs (Sect. 7). Re-running the full benchmark against the same build shortly before submission reproduced identical hit@1, hit@3 and out-of-catalogue counts; the two runs differed slightly in aggregate (2.69 vs 2.63 matches per case, median latency 1468 vs 1378 ms), which we attribute to provider-side variance, and both raw result files ship with the harness.</w:t>
+      </w:r>
+    </w:p>
+    <w:p>
+      <w:pPr>
+        <w:jc w:val="center"/>
+      </w:pPr>
+      <w:r>
+        <w:drawing>
+          <wp:inline xmlns:a="http://schemas.openxmlformats.org/drawingml/2006/main" xmlns:pic="http://schemas.openxmlformats.org/drawingml/2006/picture">
+            <wp:extent cx="4392000" cy="2635200"/>
+            <wp:docPr id="3" name="Picture 3"/>
+            <wp:cNvGraphicFramePr>
+              <a:graphicFrameLocks noChangeAspect="1"/>
+            </wp:cNvGraphicFramePr>
+            <a:graphic>
+              <a:graphicData uri="http://schemas.openxmlformats.org/drawingml/2006/picture">
+                <pic:pic>
+                  <pic:nvPicPr>
+                    <pic:cNvPr id="0" name="fig3_evaluation.png"/>
+                    <pic:cNvPicPr/>
+                  </pic:nvPicPr>
+                  <pic:blipFill>
+                    <a:blip r:embed="rId16"/>
+                    <a:stretch>
+                      <a:fillRect/>
+                    </a:stretch>
+                  </pic:blipFill>
+                  <pic:spPr>
+                    <a:xfrm>
+                      <a:off x="0" y="0"/>
+                      <a:ext cx="4392000" cy="2635200"/>
+                    </a:xfrm>
+                    <a:prstGeom prst="rect"/>
+                  </pic:spPr>
+                </pic:pic>
+              </a:graphicData>
+            </a:graphic>
+          </wp:inline>
+        </w:drawing>
+      </w:r>
+    </w:p>
+    <w:p>
+      <w:pPr>
+        <w:pStyle w:val="figurelegend"/>
+      </w:pPr>
+      <w:r>
+        <w:t>Fig. 3.  Grounded-matcher benchmark (16 cases, single annotator). Left: hit@1 by input-language group - English n=11, Hinglish/Roman Urdu n=2, Arabic, Devanagari Hindi and Bengali n=1 each; the sample is not balanced across languages. Right: per-case end-to-end route latency (includes the model-provider round trip) with median line. Footer reports aggregate metrics from the later of the two live endpoint runs.</w:t>
+      </w:r>
+    </w:p>
+    <w:p>
+      <w:pPr>
+        <w:pStyle w:val="heading20"/>
+      </w:pPr>
+      <w:r>
+        <w:t>6.2   Claim Ledger</w:t>
       </w:r>
     </w:p>
     <w:p>
@@ -585,7 +1172,7 @@
         <w:pStyle w:val="tabletitle"/>
       </w:pPr>
       <w:r>
-        <w:t>Table 1.  Validation status at submission. Rows marked “not claimed” are reported to bound the paper's claims, not to criticise them.</w:t>
+        <w:t>Table 2.  Validation status at submission. Rows marked “not claimed” are reported to bound the paper's claims, not to criticise them.</w:t>
       </w:r>
     </w:p>
     <w:tbl>
@@ -686,7 +1273,7 @@
               <w:rPr>
                 <w:sz w:val="16"/>
               </w:rPr>
-              <w:t>Proven (prototype)</w:t>
+              <w:t>Verified (prototype)</w:t>
             </w:r>
           </w:p>
         </w:tc>
@@ -727,7 +1314,7 @@
               <w:rPr>
                 <w:sz w:val="16"/>
               </w:rPr>
-              <w:t>Proven (tests + Amoy preflight)</w:t>
+              <w:t>Verified (tests + Amoy ABI preflight)</w:t>
             </w:r>
           </w:p>
         </w:tc>
@@ -768,7 +1355,7 @@
               <w:rPr>
                 <w:sz w:val="16"/>
               </w:rPr>
-              <w:t>Proven URLs; freshness unverified</w:t>
+              <w:t>URLs verified; freshness unverified</w:t>
             </w:r>
           </w:p>
         </w:tc>
@@ -783,7 +1370,7 @@
               <w:rPr>
                 <w:sz w:val="16"/>
               </w:rPr>
-              <w:t>AI grounding</w:t>
+              <w:t>AI grounding (retrieval)</w:t>
             </w:r>
           </w:p>
         </w:tc>
@@ -796,7 +1383,7 @@
               <w:rPr>
                 <w:sz w:val="16"/>
               </w:rPr>
-              <w:t>Schema-constrained IDs; non-catalogue IDs dropped</w:t>
+              <w:t>Schema-constrained ids; 16/16 benchmark hit@1, 0 out-of-catalogue</w:t>
             </w:r>
           </w:p>
         </w:tc>
@@ -809,7 +1396,7 @@
               <w:rPr>
                 <w:sz w:val="16"/>
               </w:rPr>
-              <w:t>Mechanism proven; accuracy not benchmarked</w:t>
+              <w:t>Verified on small curated benchmark; user outcomes untested</w:t>
             </w:r>
           </w:p>
         </w:tc>
@@ -850,7 +1437,7 @@
               <w:rPr>
                 <w:sz w:val="16"/>
               </w:rPr>
-              <w:t>Proven (code + UI)</w:t>
+              <w:t>Verified (code + UI)</w:t>
             </w:r>
           </w:p>
         </w:tc>
@@ -996,13 +1583,13 @@
         <w:pStyle w:val="p1a"/>
       </w:pPr>
       <w:r>
-        <w:t>We state the boundaries plainly. The chain layer runs on a public testnet with a single issuer key; production use requires mainnet deployment, key custody (HSM or multisig), and a revocation policy agreed with the institutions that would honour these anchors. The AI layer has no accuracy benchmark: grounding prevents invented services but cannot prevent a wrong catalogue match, and document extraction quality has not been measured on real, consented documents. The credential mechanism anchors user-confirmed statements; it adds no independent verification, and an adversary with the issuer key can anchor false statements - the immutable issuer address and public events make such abuse visible and attributable, not impossible. The demo mode's signed cookie is a hackathon convenience, not an identity system. Finally, the headline demographic figure used in outreach (about 88% foreign-born) is indicative and cited as such; all product claims in this paper are bounded by Table 1.</w:t>
+        <w:t>We state the boundaries plainly. The chain layer runs on a public testnet with a single issuer key; production use requires mainnet deployment, key custody (HSM or multisig), and a revocation policy agreed with the institutions that would honour these anchors. The AI layer's benchmark (Sect. 6.1) is small, single-annotator and scored against catalogue-derived ground truth: it evidences retrieval correctness, not real-world user outcomes, and document extraction quality has still not been measured on real, consented documents. Extending the benchmark with independent annotation, more diverse and ambiguous cases, out-of-scope and adversarial inputs, and a separate consented-document extraction study are the natural next measurement steps. The credential mechanism anchors user-confirmed statements; it adds no independent verification, and an adversary with the issuer key can anchor false statements - the immutable issuer address and public events make such abuse visible and attributable, not impossible. The demo mode's signed cookie is a hackathon convenience, not an identity system. Finally, the headline demographic figure used in outreach (about 88% foreign-born) is indicative and cited as such; all product claims in this paper are bounded by Table 2.</w:t>
       </w:r>
     </w:p>
     <w:p>
       <w:pPr/>
       <w:r>
-        <w:t>Ethically, the design follows data minimisation by construction: PII remains in user-partitioned tables under RLS, nothing personal is sent to the blockchain or to the model provider beyond the transient document image used for extraction, and the honest-degradation policy exists specifically so that a demonstration can never be mistaken for an operational service. Accessibility (WCAG 2.2, RTL support) and the PDPL-aligned storage model are treated as functional requirements rather than polish.</w:t>
+        <w:t>Ethically, the design follows data minimisation by construction: PII stays in user-partitioned RLS tables, nothing personal is written to the chain, and provider-side processing is scoped in Sect. 4.4. The honest-degradation policy exists so that a demonstration can never be mistaken for an operational service, and accessibility (WCAG 2.2, RTL support) and the PDPL-aligned storage model are treated as functional requirements rather than polish.</w:t>
       </w:r>
     </w:p>
     <w:p>
@@ -1018,7 +1605,7 @@
         <w:pStyle w:val="p1a"/>
       </w:pPr>
       <w:r>
-        <w:t>SANAD shows that the three barriers residents face in using even a world-class e-government - language, evidence clarity and trust - can be attacked together by a small system whose core commitments are negative: the model never invents services, the chain never sees personal data, and the product never claims more than its proofs support. The prototype passes its automated validation suite, anchors digests on a public testnet, and ships an explicit proven/not-proven ledger as part of its public surface. Next steps are a 90-day innovation pilot with a government partner: consented usability testing with service-seekers, accuracy benchmarking of the grounded matcher, mainnet custody, and integration of an institutional verifier that can check anchors without access to the off-chain snapshot. We invite evaluation of the system by exactly the standard it sets for itself: every claim verifiable, and none overstated.</w:t>
+        <w:t>SANAD shows that the three barriers residents face in using even a world-class e-government - language, evidence clarity and trust - can be attacked together by a small system whose core commitments are negative: the model never invents services, the chain never sees personal data, and the product never claims more than its proofs support. The prototype passes its automated validation suite, anchors digests on a public testnet, and ships an explicit proven/not-proven ledger as part of its public surface. The next steps we propose, rather than claim as arranged: consented usability testing with service-seekers, larger independently annotated accuracy benchmarking of the grounded matcher, mainnet custody, and integration of an institutional verifier that can check anchors without access to the off-chain snapshot. We invite evaluation of the system by exactly the standard it sets for itself: every claim verifiable, and none overstated.</w:t>
       </w:r>
     </w:p>
     <w:p>
@@ -1034,7 +1621,7 @@
         <w:pStyle w:val="reference"/>
       </w:pPr>
       <w:r>
-        <w:t>[1]  United Nations Department of Economic and Social Affairs: E-Government Survey 2024. United Nations, New York (2024)</w:t>
+        <w:t>[1]  United Nations Department of Economic and Social Affairs: E-Government Survey 2024 - Use of Digital Data to Facilitate the Future Transformation of Public Administration. United Nations, New York (2024). https://publicadministration.un.org/egovkb/en-us/reports/un-e-government-survey-2024</w:t>
       </w:r>
     </w:p>
     <w:p>
@@ -1042,7 +1629,7 @@
         <w:pStyle w:val="reference"/>
       </w:pPr>
       <w:r>
-        <w:t>[2]  Government of the United Arab Emirates: United Arab Emirates - e-Government Development. u.ae, https://u.ae/en/about-the-uae/digital-uae (accessed 2026)</w:t>
+        <w:t>[2]  Government of the United Arab Emirates: Digital UAE - e-Government Development. u.ae, https://u.ae/en/about-the-uae/digital-uae (accessed October 2026)</w:t>
       </w:r>
     </w:p>
     <w:p>
@@ -1050,7 +1637,7 @@
         <w:pStyle w:val="reference"/>
       </w:pPr>
       <w:r>
-        <w:t>[3]  World Wide Web Consortium: Verifiable Credentials Data Model 1.0 - W3C Recommendation. https://www.w3.org/TR/vc-data-model/ (2019)</w:t>
+        <w:t>[3]  World Wide Web Consortium: Verifiable Credentials Data Model v2.0. W3C Recommendation, 15 May 2025. https://www.w3.org/TR/vc-data-model/ (2025)</w:t>
       </w:r>
     </w:p>
     <w:p>
@@ -1058,7 +1645,7 @@
         <w:pStyle w:val="reference"/>
       </w:pPr>
       <w:r>
-        <w:t>[4]  MIT Digital Currency Initiative: Blockcerts - An Open Standard for Blockchain-Verified Academic Credentials. https://www.blockcerts.org/ (2017)</w:t>
+        <w:t>[4]  MIT Media Lab and Learning Machine: Blockcerts - The Open Standard for Blockchain Credentials. https://www.blockcerts.org/ (2017)</w:t>
       </w:r>
     </w:p>
     <w:p>
@@ -1066,7 +1653,7 @@
         <w:pStyle w:val="reference"/>
       </w:pPr>
       <w:r>
-        <w:t>[5]  Bapat, P., et al.: Blockchain for Academic Credentials. arXiv:2006.12665 (2020)</w:t>
+        <w:t>[5]  Bapat, C.: Blockchain for Academic Credentials. arXiv:2006.12665. arXiv (2020). https://arxiv.org/abs/2006.12665</w:t>
       </w:r>
     </w:p>
     <w:p>
@@ -1074,7 +1661,7 @@
         <w:pStyle w:val="reference"/>
       </w:pPr>
       <w:r>
-        <w:t>[6]  Sheth, R., et al.: Beyond Monolingual Assumptions: A Survey of Code-Switched NLP in the Era of Large Language Models across Modalities. arXiv:2510.07037 (2025)</w:t>
+        <w:t>[6]  Sheth, R., Sinha, S.R.S., Patil, M., Beniwal, H., Singh, M.: Beyond Monolingual Assumptions: A Survey on Code-Switched NLP in the Era of Large Language Models across Modalities. In: Proceedings of the 64th Annual Meeting of the Association for Computational Linguistics (Volume 1: Long Papers). ACL (2026). https://doi.org/10.18653/v1/2026.acl-long.386</w:t>
       </w:r>
     </w:p>
     <w:p>
@@ -1082,7 +1669,7 @@
         <w:pStyle w:val="reference"/>
       </w:pPr>
       <w:r>
-        <w:t>[7]  United Arab Emirates: Federal Decree-Law No. 45 of 2021 on the Protection of Personal Data and Privacy (2021)</w:t>
+        <w:t>[7]  United Arab Emirates: Federal Decree-Law No. 45 of 2021 Concerning the Protection of Personal Data and Privacy. https://uaelegislation.gov.ae/en/legislations/1972 (2021)</w:t>
       </w:r>
     </w:p>
     <w:p>
@@ -1090,7 +1677,7 @@
         <w:pStyle w:val="reference"/>
       </w:pPr>
       <w:r>
-        <w:t>[8]  World Wide Web Consortium: Web Content Accessibility Guidelines (WCAG) 2.2. https://www.w3.org/TR/WCAG22/ (2023)</w:t>
+        <w:t>[8]  World Wide Web Consortium: Web Content Accessibility Guidelines (WCAG) 2.2. W3C Recommendation, 5 October 2023. https://www.w3.org/TR/WCAG22/ (2023)</w:t>
       </w:r>
     </w:p>
     <w:p>
@@ -1098,7 +1685,7 @@
         <w:pStyle w:val="reference"/>
       </w:pPr>
       <w:r>
-        <w:t>[9]  Nakamoto, S.: Bitcoin: A Peer-to-Peer Electronic Cash System (2008)</w:t>
+        <w:t>[9]  Nakamoto, S.: Bitcoin: A Peer-to-Peer Electronic Cash System. https://bitcoin.org/bitcoin.pdf (2008)</w:t>
       </w:r>
     </w:p>
     <w:p>
@@ -1106,7 +1693,15 @@
         <w:pStyle w:val="reference"/>
       </w:pPr>
       <w:r>
-        <w:t>[10]  UAE Ministry of Human Resources and Emiratisation: Register labour complaints for private-sector employees. https://mohre.gov.ae/en/services/register-labor-complaints-private-sector-employees-2022 (accessed 2026)</w:t>
+        <w:t>[10]  UAE Ministry of Human Resources and Emiratisation: Register labour complaints for private-sector employees. https://mohre.gov.ae/en/services/register-labor-complaints-private-sector-employees-2022 (accessed October 2026)</w:t>
+      </w:r>
+    </w:p>
+    <w:p>
+      <w:pPr>
+        <w:pStyle w:val="reference"/>
+      </w:pPr>
+      <w:r>
+        <w:t>[11]  UAE Ministry of Foreign Affairs and International Cooperation: Facts and Figures - Population by Nationality. https://www.mofa.gov.ae/en/the-uae/facts-and-figures (accessed October 2026)</w:t>
       </w:r>
     </w:p>
     <w:sectPr>

</xml_diff>